<commit_message>
docs: record verified definition provenance evidence
</commit_message>
<xml_diff>
--- a/deliverables/AQP_Supervisor_Feedback_Closure_Matrix_v2.docx
+++ b/deliverables/AQP_Supervisor_Feedback_Closure_Matrix_v2.docx
@@ -28,7 +28,7 @@
         <w:rPr>
           <w:rFonts w:ascii="Calibri" w:hAnsi="Calibri"/>
         </w:rPr>
-        <w:t xml:space="preserve">Version: 2.4</w:t>
+        <w:t xml:space="preserve">Version: 2.5</w:t>
       </w:r>
       <w:r>
         <w:rPr>
@@ -1545,7 +1545,36 @@
                 <w:rFonts w:ascii="Calibri" w:hAnsi="Calibri"/>
                 <w:sz w:val="15"/>
               </w:rPr>
-              <w:t xml:space="preserve">Version 4 configuration/result schemas, canonical SHA-256, CSV/Qualtrics fields and fail-closed checks.</w:t>
+              <w:t xml:space="preserve">Version 4 configuration/result schemas, canonical SHA-256, immutable result definition snapshot, CSV/Qualtrics fields and fail-closed checks. The Qualtrics parent requires a valid fingerprint plus matching snapshot metadata and writes</w:t>
+            </w:r>
+            <w:r>
+              <w:rPr>
+                <w:rFonts w:ascii="Calibri" w:hAnsi="Calibri"/>
+                <w:sz w:val="15"/>
+              </w:rPr>
+              <w:t xml:space="preserve"> </w:t>
+            </w:r>
+            <w:r>
+              <w:rPr>
+                <w:rStyle w:val="VerbatimChar"/>
+                <w:rFonts w:ascii="Calibri" w:hAnsi="Calibri"/>
+                <w:sz w:val="15"/>
+              </w:rPr>
+              <w:t xml:space="preserve">AQP_ACCEPTED = 1</w:t>
+            </w:r>
+            <w:r>
+              <w:rPr>
+                <w:rFonts w:ascii="Calibri" w:hAnsi="Calibri"/>
+                <w:sz w:val="15"/>
+              </w:rPr>
+              <w:t xml:space="preserve"> </w:t>
+            </w:r>
+            <w:r>
+              <w:rPr>
+                <w:rFonts w:ascii="Calibri" w:hAnsi="Calibri"/>
+                <w:sz w:val="15"/>
+              </w:rPr>
+              <w:t xml:space="preserve">only after every staged field succeeds.</w:t>
             </w:r>
           </w:p>
         </w:tc>
@@ -1571,7 +1600,36 @@
                 <w:rFonts w:ascii="Calibri" w:hAnsi="Calibri"/>
                 <w:sz w:val="15"/>
               </w:rPr>
-              <w:t xml:space="preserve">Missing/stale hash link, submission and stored-result tamper tests; export reconstruction test.</w:t>
+              <w:t xml:space="preserve">Missing/stale hash link, submission and stored-result tamper tests; export reconstruction; missing/malformed runtime fingerprint and missing snapshot rejection; injected</w:t>
+            </w:r>
+            <w:r>
+              <w:rPr>
+                <w:rFonts w:ascii="Calibri" w:hAnsi="Calibri"/>
+                <w:sz w:val="15"/>
+              </w:rPr>
+              <w:t xml:space="preserve"> </w:t>
+            </w:r>
+            <w:r>
+              <w:rPr>
+                <w:rStyle w:val="VerbatimChar"/>
+                <w:rFonts w:ascii="Calibri" w:hAnsi="Calibri"/>
+                <w:sz w:val="15"/>
+              </w:rPr>
+              <w:t xml:space="preserve">AQP_RAW_05</w:t>
+            </w:r>
+            <w:r>
+              <w:rPr>
+                <w:rFonts w:ascii="Calibri" w:hAnsi="Calibri"/>
+                <w:sz w:val="15"/>
+              </w:rPr>
+              <w:t xml:space="preserve"> </w:t>
+            </w:r>
+            <w:r>
+              <w:rPr>
+                <w:rFonts w:ascii="Calibri" w:hAnsi="Calibri"/>
+                <w:sz w:val="15"/>
+              </w:rPr>
+              <w:t xml:space="preserve">staging failure with no acceptance marker.</w:t>
             </w:r>
           </w:p>
         </w:tc>
@@ -1597,7 +1655,58 @@
                 <w:rFonts w:ascii="Calibri" w:hAnsi="Calibri"/>
                 <w:sz w:val="15"/>
               </w:rPr>
-              <w:t xml:space="preserve">Local-pass.</w:t>
+              <w:t xml:space="preserve">CI-pass on candidate</w:t>
+            </w:r>
+            <w:r>
+              <w:rPr>
+                <w:rFonts w:ascii="Calibri" w:hAnsi="Calibri"/>
+                <w:sz w:val="15"/>
+              </w:rPr>
+              <w:t xml:space="preserve"> </w:t>
+            </w:r>
+            <w:r>
+              <w:rPr>
+                <w:rStyle w:val="VerbatimChar"/>
+                <w:rFonts w:ascii="Calibri" w:hAnsi="Calibri"/>
+                <w:sz w:val="15"/>
+              </w:rPr>
+              <w:t xml:space="preserve">4fe422c</w:t>
+            </w:r>
+            <w:r>
+              <w:rPr>
+                <w:rFonts w:ascii="Calibri" w:hAnsi="Calibri"/>
+                <w:sz w:val="15"/>
+              </w:rPr>
+              <w:t xml:space="preserve"> </w:t>
+            </w:r>
+            <w:r>
+              <w:rPr>
+                <w:rFonts w:ascii="Calibri" w:hAnsi="Calibri"/>
+                <w:sz w:val="15"/>
+              </w:rPr>
+              <w:t xml:space="preserve">in run</w:t>
+            </w:r>
+            <w:r>
+              <w:rPr>
+                <w:rFonts w:ascii="Calibri" w:hAnsi="Calibri"/>
+                <w:sz w:val="15"/>
+              </w:rPr>
+              <w:t xml:space="preserve"> </w:t>
+            </w:r>
+            <w:r>
+              <w:rPr>
+                <w:rStyle w:val="VerbatimChar"/>
+                <w:rFonts w:ascii="Calibri" w:hAnsi="Calibri"/>
+                <w:sz w:val="15"/>
+              </w:rPr>
+              <w:t xml:space="preserve">31399712181</w:t>
+            </w:r>
+            <w:r>
+              <w:rPr>
+                <w:rFonts w:ascii="Calibri" w:hAnsi="Calibri"/>
+                <w:sz w:val="15"/>
+              </w:rPr>
+              <w:t xml:space="preserve">: 208/208 deterministic tests, 9/9 rendered-browser tests, 3/3 browser-support routes and release synchronisation passed.</w:t>
             </w:r>
           </w:p>
         </w:tc>
@@ -1623,7 +1732,29 @@
                 <w:rFonts w:ascii="Calibri" w:hAnsi="Calibri"/>
                 <w:sz w:val="15"/>
               </w:rPr>
-              <w:t xml:space="preserve">CI and deployed tampered-link/submission checks. The hash proves consistency, not authenticated authorship.</w:t>
+              <w:t xml:space="preserve">Re-test tampered link/submission and one fresh synthetic Qualtrics row after an authorised deployment. Confirm</w:t>
+            </w:r>
+            <w:r>
+              <w:rPr>
+                <w:rFonts w:ascii="Calibri" w:hAnsi="Calibri"/>
+                <w:sz w:val="15"/>
+              </w:rPr>
+              <w:t xml:space="preserve"> </w:t>
+            </w:r>
+            <w:r>
+              <w:rPr>
+                <w:rStyle w:val="VerbatimChar"/>
+                <w:rFonts w:ascii="Calibri" w:hAnsi="Calibri"/>
+                <w:sz w:val="15"/>
+              </w:rPr>
+              <w:t xml:space="preserve">AQP_ACCEPTED = 1</w:t>
+            </w:r>
+            <w:r>
+              <w:rPr>
+                <w:rFonts w:ascii="Calibri" w:hAnsi="Calibri"/>
+                <w:sz w:val="15"/>
+              </w:rPr>
+              <w:t xml:space="preserve">, a valid definition hash and reconstructable raw record. The fingerprint proves internal consistency and identifiability, not authenticated authorship or resistance to replacement of both unsigned definition and hash.</w:t>
             </w:r>
           </w:p>
         </w:tc>
@@ -4143,7 +4274,7 @@
                 <w:rFonts w:ascii="Calibri" w:hAnsi="Calibri"/>
                 <w:sz w:val="15"/>
               </w:rPr>
-              <w:t xml:space="preserve">C7 requires canonical hash agreement, rejection of missing/stale Version 4 hashes and export-only reconstruction.</w:t>
+              <w:t xml:space="preserve">C7 requires canonical hash agreement, rejection of missing/stale Version 4 hashes and export-only reconstruction. Qualtrics host acceptance additionally requires a schema-complete definition snapshot and a last-write acceptance marker.</w:t>
             </w:r>
           </w:p>
         </w:tc>
@@ -4169,7 +4300,58 @@
                 <w:rFonts w:ascii="Calibri" w:hAnsi="Calibri"/>
                 <w:sz w:val="15"/>
               </w:rPr>
-              <w:t xml:space="preserve">Local-pass; release verification pending.</w:t>
+              <w:t xml:space="preserve">CI-pass on candidate</w:t>
+            </w:r>
+            <w:r>
+              <w:rPr>
+                <w:rFonts w:ascii="Calibri" w:hAnsi="Calibri"/>
+                <w:sz w:val="15"/>
+              </w:rPr>
+              <w:t xml:space="preserve"> </w:t>
+            </w:r>
+            <w:r>
+              <w:rPr>
+                <w:rStyle w:val="VerbatimChar"/>
+                <w:rFonts w:ascii="Calibri" w:hAnsi="Calibri"/>
+                <w:sz w:val="15"/>
+              </w:rPr>
+              <w:t xml:space="preserve">4fe422c</w:t>
+            </w:r>
+            <w:r>
+              <w:rPr>
+                <w:rFonts w:ascii="Calibri" w:hAnsi="Calibri"/>
+                <w:sz w:val="15"/>
+              </w:rPr>
+              <w:t xml:space="preserve"> </w:t>
+            </w:r>
+            <w:r>
+              <w:rPr>
+                <w:rFonts w:ascii="Calibri" w:hAnsi="Calibri"/>
+                <w:sz w:val="15"/>
+              </w:rPr>
+              <w:t xml:space="preserve">in run</w:t>
+            </w:r>
+            <w:r>
+              <w:rPr>
+                <w:rFonts w:ascii="Calibri" w:hAnsi="Calibri"/>
+                <w:sz w:val="15"/>
+              </w:rPr>
+              <w:t xml:space="preserve"> </w:t>
+            </w:r>
+            <w:r>
+              <w:rPr>
+                <w:rStyle w:val="VerbatimChar"/>
+                <w:rFonts w:ascii="Calibri" w:hAnsi="Calibri"/>
+                <w:sz w:val="15"/>
+              </w:rPr>
+              <w:t xml:space="preserve">31399712181</w:t>
+            </w:r>
+            <w:r>
+              <w:rPr>
+                <w:rFonts w:ascii="Calibri" w:hAnsi="Calibri"/>
+                <w:sz w:val="15"/>
+              </w:rPr>
+              <w:t xml:space="preserve">; deployment and fresh synthetic Qualtrics-row verification remain pending.</w:t>
             </w:r>
           </w:p>
         </w:tc>
@@ -5831,7 +6013,7 @@
           <w:rStyle w:val="VerbatimChar"/>
           <w:rFonts w:ascii="Calibri" w:hAnsi="Calibri"/>
         </w:rPr>
-        <w:t xml:space="preserve">816e1c4</w:t>
+        <w:t xml:space="preserve">4fe422c</w:t>
       </w:r>
       <w:r>
         <w:rPr>
@@ -5856,7 +6038,7 @@
           <w:rPr>
             <w:rStyle w:val="Hyperlink"/>
           </w:rPr>
-          <w:t xml:space="preserve">31377511113</w:t>
+          <w:t xml:space="preserve">31399712181</w:t>
         </w:r>
       </w:hyperlink>
       <w:r>
@@ -5875,7 +6057,7 @@
         <w:rPr>
           <w:rFonts w:ascii="Calibri" w:hAnsi="Calibri"/>
         </w:rPr>
-        <w:t xml:space="preserve">20/20 files and 199/199 tests passed; 8</w:t>
+        <w:t xml:space="preserve">20/20 files and 208/208 tests passed; 8</w:t>
       </w:r>
       <w:r>
         <w:rPr>
@@ -5992,7 +6174,7 @@
           <w:rStyle w:val="VerbatimChar"/>
           <w:rFonts w:ascii="Calibri" w:hAnsi="Calibri"/>
         </w:rPr>
-        <w:t xml:space="preserve">816e1c4</w:t>
+        <w:t xml:space="preserve">4fe422c</w:t>
       </w:r>
       <w:r>
         <w:rPr>
@@ -6051,13 +6233,13 @@
           <w:rStyle w:val="VerbatimChar"/>
           <w:rFonts w:ascii="Calibri" w:hAnsi="Calibri"/>
         </w:rPr>
-        <w:t xml:space="preserve">31377511113</w:t>
-      </w:r>
-      <w:r>
-        <w:rPr>
-          <w:rFonts w:ascii="Calibri" w:hAnsi="Calibri"/>
-        </w:rPr>
-        <w:t xml:space="preserve">, artifact IDs</w:t>
+        <w:t xml:space="preserve">31399712181</w:t>
+      </w:r>
+      <w:r>
+        <w:rPr>
+          <w:rFonts w:ascii="Calibri" w:hAnsi="Calibri"/>
+        </w:rPr>
+        <w:t xml:space="preserve">; rendered artifact</w:t>
       </w:r>
       <w:r>
         <w:rPr>
@@ -6070,7 +6252,13 @@
           <w:rStyle w:val="VerbatimChar"/>
           <w:rFonts w:ascii="Calibri" w:hAnsi="Calibri"/>
         </w:rPr>
-        <w:t xml:space="preserve">9058573437</w:t>
+        <w:t xml:space="preserve">9067181758</w:t>
+      </w:r>
+      <w:r>
+        <w:rPr>
+          <w:rFonts w:ascii="Calibri" w:hAnsi="Calibri"/>
+        </w:rPr>
+        <w:t xml:space="preserve">, SHA-256</w:t>
       </w:r>
       <w:r>
         <w:rPr>
@@ -6080,9 +6268,16 @@
       </w:r>
       <w:r>
         <w:rPr>
-          <w:rFonts w:ascii="Calibri" w:hAnsi="Calibri"/>
-        </w:rPr>
-        <w:t xml:space="preserve">and</w:t>
+          <w:rStyle w:val="VerbatimChar"/>
+          <w:rFonts w:ascii="Calibri" w:hAnsi="Calibri"/>
+        </w:rPr>
+        <w:t xml:space="preserve">52b4631a98d03857d10356632bf09a3c7ac3627a1f7dca822b9052f2a02a8adb</w:t>
+      </w:r>
+      <w:r>
+        <w:rPr>
+          <w:rFonts w:ascii="Calibri" w:hAnsi="Calibri"/>
+        </w:rPr>
+        <w:t xml:space="preserve">; quantified artifact</w:t>
       </w:r>
       <w:r>
         <w:rPr>
@@ -6095,7 +6290,26 @@
           <w:rStyle w:val="VerbatimChar"/>
           <w:rFonts w:ascii="Calibri" w:hAnsi="Calibri"/>
         </w:rPr>
-        <w:t xml:space="preserve">9058513218</w:t>
+        <w:t xml:space="preserve">9067100601</w:t>
+      </w:r>
+      <w:r>
+        <w:rPr>
+          <w:rFonts w:ascii="Calibri" w:hAnsi="Calibri"/>
+        </w:rPr>
+        <w:t xml:space="preserve">, SHA-256</w:t>
+      </w:r>
+      <w:r>
+        <w:rPr>
+          <w:rFonts w:ascii="Calibri" w:hAnsi="Calibri"/>
+        </w:rPr>
+        <w:t xml:space="preserve"> </w:t>
+      </w:r>
+      <w:r>
+        <w:rPr>
+          <w:rStyle w:val="VerbatimChar"/>
+          <w:rFonts w:ascii="Calibri" w:hAnsi="Calibri"/>
+        </w:rPr>
+        <w:t xml:space="preserve">10bc877be89e9ed32c397e4d15a36aae324389a871386280661e3b74f4cd8686</w:t>
       </w:r>
       <w:r>
         <w:rPr>

</xml_diff>

<commit_message>
docs: bind browser evidence to verified candidate
</commit_message>
<xml_diff>
--- a/deliverables/AQP_Supervisor_Feedback_Closure_Matrix_v2.docx
+++ b/deliverables/AQP_Supervisor_Feedback_Closure_Matrix_v2.docx
@@ -28,7 +28,7 @@
         <w:rPr>
           <w:rFonts w:ascii="Calibri" w:hAnsi="Calibri"/>
         </w:rPr>
-        <w:t xml:space="preserve">Version: 2.5</w:t>
+        <w:t xml:space="preserve">Version: 2.6</w:t>
       </w:r>
       <w:r>
         <w:rPr>
@@ -1926,14 +1926,7 @@
                 <w:rFonts w:ascii="Calibri" w:hAnsi="Calibri"/>
                 <w:sz w:val="15"/>
               </w:rPr>
-              <w:t xml:space="preserve">816e1c4</w:t>
-            </w:r>
-            <w:r>
-              <w:rPr>
-                <w:rFonts w:ascii="Calibri" w:hAnsi="Calibri"/>
-                <w:sz w:val="15"/>
-              </w:rPr>
-              <w:t xml:space="preserve">: 135/135 rows, 0 violations, 0 overflow failures, 0 critical target-size failures and 0 missing combinations. Thirteen incomplete</w:t>
+              <w:t xml:space="preserve">4fe422c</w:t>
             </w:r>
             <w:r>
               <w:rPr>
@@ -1944,10 +1937,46 @@
             </w:r>
             <w:r>
               <w:rPr>
+                <w:rFonts w:ascii="Calibri" w:hAnsi="Calibri"/>
+                <w:sz w:val="15"/>
+              </w:rPr>
+              <w:t xml:space="preserve">in run</w:t>
+            </w:r>
+            <w:r>
+              <w:rPr>
+                <w:rFonts w:ascii="Calibri" w:hAnsi="Calibri"/>
+                <w:sz w:val="15"/>
+              </w:rPr>
+              <w:t xml:space="preserve"> </w:t>
+            </w:r>
+            <w:r>
+              <w:rPr>
                 <w:rStyle w:val="VerbatimChar"/>
                 <w:rFonts w:ascii="Calibri" w:hAnsi="Calibri"/>
                 <w:sz w:val="15"/>
               </w:rPr>
+              <w:t xml:space="preserve">31399712181</w:t>
+            </w:r>
+            <w:r>
+              <w:rPr>
+                <w:rFonts w:ascii="Calibri" w:hAnsi="Calibri"/>
+                <w:sz w:val="15"/>
+              </w:rPr>
+              <w:t xml:space="preserve">: 27 states × 5 profiles = 135/135 rows; 0 automatically detected axe violations; 13 incomplete</w:t>
+            </w:r>
+            <w:r>
+              <w:rPr>
+                <w:rFonts w:ascii="Calibri" w:hAnsi="Calibri"/>
+                <w:sz w:val="15"/>
+              </w:rPr>
+              <w:t xml:space="preserve"> </w:t>
+            </w:r>
+            <w:r>
+              <w:rPr>
+                <w:rStyle w:val="VerbatimChar"/>
+                <w:rFonts w:ascii="Calibri" w:hAnsi="Calibri"/>
+                <w:sz w:val="15"/>
+              </w:rPr>
               <w:t xml:space="preserve">color-contrast</w:t>
             </w:r>
             <w:r>
@@ -1962,7 +1991,51 @@
                 <w:rFonts w:ascii="Calibri" w:hAnsi="Calibri"/>
                 <w:sz w:val="15"/>
               </w:rPr>
-              <w:t xml:space="preserve">scan results involving 20 gaze-state node occurrences are listed with targets/failure summaries and remain inspection items; a target may recur across state/profile rows.</w:t>
+              <w:t xml:space="preserve">results involving 20 node occurrences retained for manual inspection; 0 horizontal-overflow failures; 0 critical target-size failures; and 0 missing state/profile combinations. Retained rendered artifact</w:t>
+            </w:r>
+            <w:r>
+              <w:rPr>
+                <w:rFonts w:ascii="Calibri" w:hAnsi="Calibri"/>
+                <w:sz w:val="15"/>
+              </w:rPr>
+              <w:t xml:space="preserve"> </w:t>
+            </w:r>
+            <w:r>
+              <w:rPr>
+                <w:rStyle w:val="VerbatimChar"/>
+                <w:rFonts w:ascii="Calibri" w:hAnsi="Calibri"/>
+                <w:sz w:val="15"/>
+              </w:rPr>
+              <w:t xml:space="preserve">9067181758</w:t>
+            </w:r>
+            <w:r>
+              <w:rPr>
+                <w:rFonts w:ascii="Calibri" w:hAnsi="Calibri"/>
+                <w:sz w:val="15"/>
+              </w:rPr>
+              <w:t xml:space="preserve">, SHA-256</w:t>
+            </w:r>
+            <w:r>
+              <w:rPr>
+                <w:rFonts w:ascii="Calibri" w:hAnsi="Calibri"/>
+                <w:sz w:val="15"/>
+              </w:rPr>
+              <w:t xml:space="preserve"> </w:t>
+            </w:r>
+            <w:r>
+              <w:rPr>
+                <w:rStyle w:val="VerbatimChar"/>
+                <w:rFonts w:ascii="Calibri" w:hAnsi="Calibri"/>
+                <w:sz w:val="15"/>
+              </w:rPr>
+              <w:t xml:space="preserve">52b4631a98d03857d10356632bf09a3c7ac3627a1f7dca822b9052f2a02a8adb</w:t>
+            </w:r>
+            <w:r>
+              <w:rPr>
+                <w:rFonts w:ascii="Calibri" w:hAnsi="Calibri"/>
+                <w:sz w:val="15"/>
+              </w:rPr>
+              <w:t xml:space="preserve">. This is bounded browser automation, not a complete WCAG or assistive-technology usability result.</w:t>
             </w:r>
           </w:p>
         </w:tc>

</xml_diff>